<commit_message>
cambios a la documentacion
</commit_message>
<xml_diff>
--- a/Documentation/Guia de Cambio de Modulos.docx
+++ b/Documentation/Guia de Cambio de Modulos.docx
@@ -1,34 +1,88 @@
 
 <file path=word/document.xml><?xml version="1.0" encoding="utf-8"?>
-<w:document xmlns:wpc="http://schemas.microsoft.com/office/word/2010/wordprocessingCanvas" xmlns:cx="http://schemas.microsoft.com/office/drawing/2014/chartex" xmlns:cx1="http://schemas.microsoft.com/office/drawing/2015/9/8/chartex" xmlns:cx2="http://schemas.microsoft.com/office/drawing/2015/10/21/chartex" xmlns:cx3="http://schemas.microsoft.com/office/drawing/2016/5/9/chartex" xmlns:cx4="http://schemas.microsoft.com/office/drawing/2016/5/10/chartex" xmlns:cx5="http://schemas.microsoft.com/office/drawing/2016/5/11/chartex" xmlns:cx6="http://schemas.microsoft.com/office/drawing/2016/5/12/chartex" xmlns:cx7="http://schemas.microsoft.com/office/drawing/2016/5/13/chartex" xmlns:cx8="http://schemas.microsoft.com/office/drawing/2016/5/14/chartex" xmlns:mc="http://schemas.openxmlformats.org/markup-compatibility/2006" xmlns:aink="http://schemas.microsoft.com/office/drawing/2016/ink" xmlns:am3d="http://schemas.microsoft.com/office/drawing/2017/model3d" xmlns:o="urn:schemas-microsoft-com:office:office" xmlns:r="http://schemas.openxmlformats.org/officeDocument/2006/relationships" xmlns:m="http://schemas.openxmlformats.org/officeDocument/2006/math" xmlns:v="urn:schemas-microsoft-com:vml" xmlns:wp14="http://schemas.microsoft.com/office/word/2010/wordprocessingDrawing" xmlns:wp="http://schemas.openxmlformats.org/drawingml/2006/wordprocessingDrawing" xmlns:w10="urn:schemas-microsoft-com:office:word" xmlns:w="http://schemas.openxmlformats.org/wordprocessingml/2006/main" xmlns:w14="http://schemas.microsoft.com/office/word/2010/wordml" xmlns:w15="http://schemas.microsoft.com/office/word/2012/wordml" xmlns:w16cex="http://schemas.microsoft.com/office/word/2018/wordml/cex" xmlns:w16cid="http://schemas.microsoft.com/office/word/2016/wordml/cid" xmlns:w16="http://schemas.microsoft.com/office/word/2018/wordml" xmlns:w16se="http://schemas.microsoft.com/office/word/2015/wordml/symex" xmlns:wpg="http://schemas.microsoft.com/office/word/2010/wordprocessingGroup" xmlns:wpi="http://schemas.microsoft.com/office/word/2010/wordprocessingInk" xmlns:wne="http://schemas.microsoft.com/office/word/2006/wordml" xmlns:wps="http://schemas.microsoft.com/office/word/2010/wordprocessingShape" mc:Ignorable="w14 w15 w16se w16cid w16 w16cex wp14">
+<w:document xmlns:wpc="http://schemas.microsoft.com/office/word/2010/wordprocessingCanvas" xmlns:cx="http://schemas.microsoft.com/office/drawing/2014/chartex" xmlns:cx1="http://schemas.microsoft.com/office/drawing/2015/9/8/chartex" xmlns:mc="http://schemas.openxmlformats.org/markup-compatibility/2006" xmlns:o="urn:schemas-microsoft-com:office:office" xmlns:r="http://schemas.openxmlformats.org/officeDocument/2006/relationships" xmlns:m="http://schemas.openxmlformats.org/officeDocument/2006/math" xmlns:v="urn:schemas-microsoft-com:vml" xmlns:wp14="http://schemas.microsoft.com/office/word/2010/wordprocessingDrawing" xmlns:wp="http://schemas.openxmlformats.org/drawingml/2006/wordprocessingDrawing" xmlns:w10="urn:schemas-microsoft-com:office:word" xmlns:w="http://schemas.openxmlformats.org/wordprocessingml/2006/main" xmlns:w14="http://schemas.microsoft.com/office/word/2010/wordml" xmlns:w15="http://schemas.microsoft.com/office/word/2012/wordml" xmlns:w16se="http://schemas.microsoft.com/office/word/2015/wordml/symex" xmlns:wpg="http://schemas.microsoft.com/office/word/2010/wordprocessingGroup" xmlns:wpi="http://schemas.microsoft.com/office/word/2010/wordprocessingInk" xmlns:wne="http://schemas.microsoft.com/office/word/2006/wordml" xmlns:wps="http://schemas.microsoft.com/office/word/2010/wordprocessingShape" mc:Ignorable="w14 w15 w16se wp14">
   <w:body>
-    <w:p/>
-    <w:p>
+    <w:p>
+      <w:pPr>
+        <w:pStyle w:val="Title"/>
+        <w:jc w:val="both"/>
+        <w:rPr>
+          <w:u w:val="single"/>
+          <w:lang w:val="es-AR"/>
+        </w:rPr>
+      </w:pPr>
+      <w:r>
+        <w:rPr>
+          <w:u w:val="single"/>
+          <w:lang w:val="es-AR"/>
+        </w:rPr>
+        <w:t>Guía</w:t>
+      </w:r>
+      <w:r>
+        <w:rPr>
+          <w:u w:val="single"/>
+          <w:lang w:val="es-AR"/>
+        </w:rPr>
+        <w:t xml:space="preserve"> de Cambio de </w:t>
+      </w:r>
+      <w:r>
+        <w:rPr>
+          <w:u w:val="single"/>
+          <w:lang w:val="es-AR"/>
+        </w:rPr>
+        <w:t>Drivers</w:t>
+      </w:r>
+    </w:p>
+    <w:p>
+      <w:pPr>
+        <w:jc w:val="both"/>
+        <w:rPr>
+          <w:lang w:val="es-AR"/>
+        </w:rPr>
+      </w:pPr>
+    </w:p>
+    <w:p>
+      <w:pPr>
+        <w:pStyle w:val="Heading1"/>
+        <w:jc w:val="both"/>
+      </w:pPr>
+      <w:r>
+        <w:t>1. Estructura de los Archivos:</w:t>
+      </w:r>
+    </w:p>
+    <w:p>
+      <w:pPr>
+        <w:jc w:val="both"/>
+        <w:rPr>
+          <w:lang w:val="es-AR"/>
+        </w:rPr>
+      </w:pPr>
       <w:r>
         <w:rPr>
           <w:noProof/>
+          <w:lang w:val="es-AR" w:eastAsia="es-AR"/>
         </w:rPr>
         <w:drawing>
-          <wp:anchor distT="0" distB="0" distL="114300" distR="114300" simplePos="0" relativeHeight="251658240" behindDoc="1" locked="0" layoutInCell="1" allowOverlap="1" wp14:anchorId="24834A59" wp14:editId="5B67EAAE">
+          <wp:anchor distT="0" distB="0" distL="114300" distR="114300" simplePos="0" relativeHeight="251659264" behindDoc="1" locked="0" layoutInCell="1" allowOverlap="1" wp14:anchorId="19199B5C" wp14:editId="6EEC05BE">
             <wp:simplePos x="0" y="0"/>
             <wp:positionH relativeFrom="margin">
-              <wp:align>center</wp:align>
+              <wp:align>right</wp:align>
             </wp:positionH>
             <wp:positionV relativeFrom="paragraph">
-              <wp:posOffset>124460</wp:posOffset>
+              <wp:posOffset>4019550</wp:posOffset>
             </wp:positionV>
-            <wp:extent cx="4782217" cy="4458322"/>
-            <wp:effectExtent l="0" t="0" r="0" b="0"/>
+            <wp:extent cx="6646545" cy="2900045"/>
+            <wp:effectExtent l="0" t="0" r="1905" b="0"/>
             <wp:wrapTight wrapText="bothSides">
               <wp:wrapPolygon edited="0">
                 <wp:start x="0" y="0"/>
-                <wp:lineTo x="0" y="21508"/>
-                <wp:lineTo x="21511" y="21508"/>
-                <wp:lineTo x="21511" y="0"/>
+                <wp:lineTo x="0" y="21425"/>
+                <wp:lineTo x="21544" y="21425"/>
+                <wp:lineTo x="21544" y="0"/>
                 <wp:lineTo x="0" y="0"/>
               </wp:wrapPolygon>
             </wp:wrapTight>
-            <wp:docPr id="1" name="Picture 1"/>
+            <wp:docPr id="3" name="Picture 3"/>
             <wp:cNvGraphicFramePr>
               <a:graphicFrameLocks xmlns:a="http://schemas.openxmlformats.org/drawingml/2006/main" noChangeAspect="1"/>
             </wp:cNvGraphicFramePr>
@@ -54,7 +108,7 @@
                   <pic:spPr>
                     <a:xfrm>
                       <a:off x="0" y="0"/>
-                      <a:ext cx="4782217" cy="4458322"/>
+                      <a:ext cx="6646545" cy="2900045"/>
                     </a:xfrm>
                     <a:prstGeom prst="rect">
                       <a:avLst/>
@@ -66,33 +120,46 @@
           </wp:anchor>
         </w:drawing>
       </w:r>
-    </w:p>
-    <w:p>
+      <w:r>
+        <w:rPr>
+          <w:lang w:val="es-AR"/>
+        </w:rPr>
+        <w:t>Los archivos de administración de dispositivos conectados se encuentran en la carpeta “Drivers” en el directorio principal.</w:t>
+      </w:r>
+    </w:p>
+    <w:p>
+      <w:pPr>
+        <w:jc w:val="both"/>
+        <w:rPr>
+          <w:lang w:val="es-AR"/>
+        </w:rPr>
+      </w:pPr>
       <w:r>
         <w:rPr>
           <w:noProof/>
+          <w:lang w:val="es-AR" w:eastAsia="es-AR"/>
         </w:rPr>
         <w:drawing>
-          <wp:anchor distT="0" distB="0" distL="114300" distR="114300" simplePos="0" relativeHeight="251659264" behindDoc="1" locked="0" layoutInCell="1" allowOverlap="1" wp14:anchorId="1F273875" wp14:editId="4BE1F628">
+          <wp:anchor distT="0" distB="0" distL="114300" distR="114300" simplePos="0" relativeHeight="251658240" behindDoc="1" locked="0" layoutInCell="1" allowOverlap="1" wp14:anchorId="325F3629" wp14:editId="35ED8A96">
             <wp:simplePos x="0" y="0"/>
-            <wp:positionH relativeFrom="margin">
-              <wp:align>right</wp:align>
+            <wp:positionH relativeFrom="column">
+              <wp:posOffset>0</wp:posOffset>
             </wp:positionH>
             <wp:positionV relativeFrom="paragraph">
-              <wp:posOffset>-571500</wp:posOffset>
+              <wp:posOffset>-3175</wp:posOffset>
             </wp:positionV>
-            <wp:extent cx="6646545" cy="3898900"/>
-            <wp:effectExtent l="0" t="0" r="1905" b="6350"/>
+            <wp:extent cx="6646545" cy="3503930"/>
+            <wp:effectExtent l="0" t="0" r="1905" b="1270"/>
             <wp:wrapTight wrapText="bothSides">
               <wp:wrapPolygon edited="0">
                 <wp:start x="0" y="0"/>
-                <wp:lineTo x="0" y="21530"/>
-                <wp:lineTo x="21544" y="21530"/>
+                <wp:lineTo x="0" y="21490"/>
+                <wp:lineTo x="21544" y="21490"/>
                 <wp:lineTo x="21544" y="0"/>
                 <wp:lineTo x="0" y="0"/>
               </wp:wrapPolygon>
             </wp:wrapTight>
-            <wp:docPr id="2" name="Picture 2"/>
+            <wp:docPr id="1" name="Picture 1"/>
             <wp:cNvGraphicFramePr>
               <a:graphicFrameLocks xmlns:a="http://schemas.openxmlformats.org/drawingml/2006/main" noChangeAspect="1"/>
             </wp:cNvGraphicFramePr>
@@ -118,7 +185,7 @@
                   <pic:spPr>
                     <a:xfrm>
                       <a:off x="0" y="0"/>
-                      <a:ext cx="6646545" cy="3898900"/>
+                      <a:ext cx="6646545" cy="3503930"/>
                     </a:xfrm>
                     <a:prstGeom prst="rect">
                       <a:avLst/>
@@ -130,33 +197,162 @@
           </wp:anchor>
         </w:drawing>
       </w:r>
-    </w:p>
-    <w:p/>
-    <w:p/>
-    <w:p/>
-    <w:p/>
-    <w:p/>
-    <w:p/>
-    <w:p/>
-    <w:p/>
-    <w:p/>
-    <w:p/>
-    <w:p/>
-    <w:p/>
-    <w:p/>
-    <w:p/>
-    <w:p/>
-    <w:p>
+      <w:r>
+        <w:rPr>
+          <w:lang w:val="es-AR"/>
+        </w:rPr>
+        <w:t xml:space="preserve">Cada tipo de dispositivo usado en el programa tiene su propia carpeta. Estas carpetas </w:t>
+      </w:r>
+      <w:r>
+        <w:rPr>
+          <w:lang w:val="es-AR"/>
+        </w:rPr>
+        <w:t>contienen en su interior todo lo necesario para hacer funcionar el dispositivo y poder elegirlo.</w:t>
+      </w:r>
+      <w:r>
+        <w:rPr>
+          <w:lang w:val="es-AR"/>
+        </w:rPr>
+        <w:t xml:space="preserve"> Puntualmente es necesario tener el</w:t>
+      </w:r>
+      <w:r>
+        <w:rPr>
+          <w:lang w:val="es-AR"/>
+        </w:rPr>
+        <w:t xml:space="preserve"> archivo de Python que incluye el driver de Lantz, el selector de fungen y cualquier archivo extra necesario.</w:t>
+      </w:r>
+      <w:r>
+        <w:rPr>
+          <w:lang w:val="es-AR"/>
+        </w:rPr>
+        <w:t xml:space="preserve"> </w:t>
+      </w:r>
+      <w:r>
+        <w:rPr>
+          <w:lang w:val="es-AR"/>
+        </w:rPr>
+        <w:t xml:space="preserve">Por </w:t>
+      </w:r>
+      <w:r>
+        <w:rPr>
+          <w:lang w:val="es-AR"/>
+        </w:rPr>
+        <w:t>ejemplo,</w:t>
+      </w:r>
+      <w:r>
+        <w:rPr>
+          <w:lang w:val="es-AR"/>
+        </w:rPr>
+        <w:t xml:space="preserve"> el driver del </w:t>
+      </w:r>
+      <w:proofErr w:type="spellStart"/>
+      <w:r>
+        <w:rPr>
+          <w:lang w:val="es-AR"/>
+        </w:rPr>
+        <w:t>lockin</w:t>
+      </w:r>
+      <w:proofErr w:type="spellEnd"/>
+      <w:r>
+        <w:rPr>
+          <w:lang w:val="es-AR"/>
+        </w:rPr>
+        <w:t xml:space="preserve"> tiene un “.</w:t>
+      </w:r>
+      <w:proofErr w:type="spellStart"/>
+      <w:r>
+        <w:rPr>
+          <w:lang w:val="es-AR"/>
+        </w:rPr>
+        <w:t>dll</w:t>
+      </w:r>
+      <w:proofErr w:type="spellEnd"/>
+      <w:r>
+        <w:rPr>
+          <w:lang w:val="es-AR"/>
+        </w:rPr>
+        <w:t xml:space="preserve">” provisto por el </w:t>
+      </w:r>
+      <w:proofErr w:type="spellStart"/>
+      <w:r>
+        <w:rPr>
+          <w:lang w:val="es-AR"/>
+        </w:rPr>
+        <w:t>Anfatec</w:t>
+      </w:r>
+      <w:proofErr w:type="spellEnd"/>
+      <w:r>
+        <w:rPr>
+          <w:lang w:val="es-AR"/>
+        </w:rPr>
+        <w:t>.</w:t>
+      </w:r>
+    </w:p>
+    <w:p>
+      <w:pPr>
+        <w:jc w:val="both"/>
+        <w:rPr>
+          <w:lang w:val="es-AR"/>
+        </w:rPr>
+      </w:pPr>
+      <w:r>
+        <w:rPr>
+          <w:lang w:val="es-AR"/>
+        </w:rPr>
+        <w:t>Ej. de Generador de Funciones:</w:t>
+      </w:r>
+    </w:p>
+    <w:p>
+      <w:pPr>
+        <w:tabs>
+          <w:tab w:val="left" w:pos="6585"/>
+        </w:tabs>
+        <w:jc w:val="both"/>
+        <w:rPr>
+          <w:lang w:val="es-AR"/>
+        </w:rPr>
+      </w:pPr>
+      <w:r>
+        <w:rPr>
+          <w:lang w:val="es-AR"/>
+        </w:rPr>
+        <w:tab/>
+      </w:r>
+    </w:p>
+    <w:p>
+      <w:pPr>
+        <w:jc w:val="both"/>
+        <w:rPr>
+          <w:lang w:val="es-AR"/>
+        </w:rPr>
+      </w:pPr>
       <w:r>
         <w:rPr>
           <w:noProof/>
+          <w:lang w:val="es-AR" w:eastAsia="es-AR"/>
         </w:rPr>
         <w:lastRenderedPageBreak/>
         <w:drawing>
-          <wp:inline distT="0" distB="0" distL="0" distR="0" wp14:anchorId="6EE9A9CA" wp14:editId="15238A5E">
-            <wp:extent cx="4820323" cy="1000265"/>
-            <wp:effectExtent l="0" t="0" r="0" b="9525"/>
-            <wp:docPr id="3" name="Picture 3"/>
+          <wp:anchor distT="0" distB="0" distL="114300" distR="114300" simplePos="0" relativeHeight="251660288" behindDoc="1" locked="0" layoutInCell="1" allowOverlap="1" wp14:anchorId="002318A9" wp14:editId="3021D1AD">
+            <wp:simplePos x="0" y="0"/>
+            <wp:positionH relativeFrom="column">
+              <wp:posOffset>0</wp:posOffset>
+            </wp:positionH>
+            <wp:positionV relativeFrom="paragraph">
+              <wp:posOffset>0</wp:posOffset>
+            </wp:positionV>
+            <wp:extent cx="6646545" cy="1868170"/>
+            <wp:effectExtent l="0" t="0" r="1905" b="0"/>
+            <wp:wrapTight wrapText="bothSides">
+              <wp:wrapPolygon edited="0">
+                <wp:start x="0" y="0"/>
+                <wp:lineTo x="0" y="21365"/>
+                <wp:lineTo x="21544" y="21365"/>
+                <wp:lineTo x="21544" y="0"/>
+                <wp:lineTo x="0" y="0"/>
+              </wp:wrapPolygon>
+            </wp:wrapTight>
+            <wp:docPr id="4" name="Picture 4"/>
             <wp:cNvGraphicFramePr>
               <a:graphicFrameLocks xmlns:a="http://schemas.openxmlformats.org/drawingml/2006/main" noChangeAspect="1"/>
             </wp:cNvGraphicFramePr>
@@ -168,7 +364,13 @@
                     <pic:cNvPicPr/>
                   </pic:nvPicPr>
                   <pic:blipFill>
-                    <a:blip r:embed="rId7"/>
+                    <a:blip r:embed="rId7">
+                      <a:extLst>
+                        <a:ext uri="{28A0092B-C50C-407E-A947-70E740481C1C}">
+                          <a14:useLocalDpi xmlns:a14="http://schemas.microsoft.com/office/drawing/2010/main" val="0"/>
+                        </a:ext>
+                      </a:extLst>
+                    </a:blip>
                     <a:stretch>
                       <a:fillRect/>
                     </a:stretch>
@@ -176,7 +378,7 @@
                   <pic:spPr>
                     <a:xfrm>
                       <a:off x="0" y="0"/>
-                      <a:ext cx="4820323" cy="1000265"/>
+                      <a:ext cx="6646545" cy="1868170"/>
                     </a:xfrm>
                     <a:prstGeom prst="rect">
                       <a:avLst/>
@@ -185,20 +387,87 @@
                 </pic:pic>
               </a:graphicData>
             </a:graphic>
-          </wp:inline>
+          </wp:anchor>
         </w:drawing>
       </w:r>
     </w:p>
     <w:p>
+      <w:pPr>
+        <w:pStyle w:val="Heading1"/>
+        <w:jc w:val="both"/>
+      </w:pPr>
+      <w:r>
+        <w:t xml:space="preserve">2. Selección de </w:t>
+      </w:r>
+      <w:r>
+        <w:t>Módulos</w:t>
+      </w:r>
+    </w:p>
+    <w:p>
+      <w:pPr>
+        <w:jc w:val="both"/>
+        <w:rPr>
+          <w:lang w:val="es-AR"/>
+        </w:rPr>
+      </w:pPr>
+      <w:r>
+        <w:rPr>
+          <w:lang w:val="es-AR"/>
+        </w:rPr>
+        <w:t>Cada dispositivo tiene una lista desplegable donde se muestran las opciones disponibles para seleccionar un dispositivo. Ej</w:t>
+      </w:r>
+      <w:r>
+        <w:rPr>
+          <w:lang w:val="es-AR"/>
+        </w:rPr>
+        <w:t>.</w:t>
+      </w:r>
+      <w:r>
+        <w:rPr>
+          <w:lang w:val="es-AR"/>
+        </w:rPr>
+        <w:t xml:space="preserve"> Del generador de funciones y sus </w:t>
+      </w:r>
+      <w:r>
+        <w:rPr>
+          <w:lang w:val="es-AR"/>
+        </w:rPr>
+        <w:t>opciones:</w:t>
+      </w:r>
+    </w:p>
+    <w:p>
+      <w:pPr>
+        <w:jc w:val="both"/>
+        <w:rPr>
+          <w:lang w:val="es-AR"/>
+        </w:rPr>
+      </w:pPr>
       <w:r>
         <w:rPr>
           <w:noProof/>
+          <w:lang w:val="es-AR" w:eastAsia="es-AR"/>
         </w:rPr>
         <w:drawing>
-          <wp:inline distT="0" distB="0" distL="0" distR="0" wp14:anchorId="3F700351" wp14:editId="473C1F5B">
-            <wp:extent cx="6220693" cy="504895"/>
-            <wp:effectExtent l="0" t="0" r="8890" b="9525"/>
-            <wp:docPr id="5" name="Picture 5"/>
+          <wp:anchor distT="0" distB="0" distL="114300" distR="114300" simplePos="0" relativeHeight="251662336" behindDoc="1" locked="0" layoutInCell="1" allowOverlap="1" wp14:anchorId="305AE042" wp14:editId="490EA98E">
+            <wp:simplePos x="0" y="0"/>
+            <wp:positionH relativeFrom="column">
+              <wp:posOffset>323850</wp:posOffset>
+            </wp:positionH>
+            <wp:positionV relativeFrom="paragraph">
+              <wp:posOffset>12700</wp:posOffset>
+            </wp:positionV>
+            <wp:extent cx="2047875" cy="923925"/>
+            <wp:effectExtent l="0" t="0" r="9525" b="9525"/>
+            <wp:wrapTight wrapText="bothSides">
+              <wp:wrapPolygon edited="0">
+                <wp:start x="0" y="0"/>
+                <wp:lineTo x="0" y="21377"/>
+                <wp:lineTo x="21500" y="21377"/>
+                <wp:lineTo x="21500" y="0"/>
+                <wp:lineTo x="0" y="0"/>
+              </wp:wrapPolygon>
+            </wp:wrapTight>
+            <wp:docPr id="7" name="Picture 7"/>
             <wp:cNvGraphicFramePr>
               <a:graphicFrameLocks xmlns:a="http://schemas.openxmlformats.org/drawingml/2006/main" noChangeAspect="1"/>
             </wp:cNvGraphicFramePr>
@@ -206,57 +475,66 @@
               <a:graphicData uri="http://schemas.openxmlformats.org/drawingml/2006/picture">
                 <pic:pic xmlns:pic="http://schemas.openxmlformats.org/drawingml/2006/picture">
                   <pic:nvPicPr>
-                    <pic:cNvPr id="1" name=""/>
-                    <pic:cNvPicPr/>
+                    <pic:cNvPr id="0" name="Picture 2"/>
+                    <pic:cNvPicPr>
+                      <a:picLocks noChangeAspect="1" noChangeArrowheads="1"/>
+                    </pic:cNvPicPr>
                   </pic:nvPicPr>
                   <pic:blipFill>
-                    <a:blip r:embed="rId8"/>
+                    <a:blip r:embed="rId8">
+                      <a:extLst>
+                        <a:ext uri="{28A0092B-C50C-407E-A947-70E740481C1C}">
+                          <a14:useLocalDpi xmlns:a14="http://schemas.microsoft.com/office/drawing/2010/main" val="0"/>
+                        </a:ext>
+                      </a:extLst>
+                    </a:blip>
+                    <a:srcRect/>
                     <a:stretch>
                       <a:fillRect/>
                     </a:stretch>
                   </pic:blipFill>
-                  <pic:spPr>
+                  <pic:spPr bwMode="auto">
                     <a:xfrm>
                       <a:off x="0" y="0"/>
-                      <a:ext cx="6220693" cy="504895"/>
+                      <a:ext cx="2047875" cy="923925"/>
                     </a:xfrm>
                     <a:prstGeom prst="rect">
                       <a:avLst/>
                     </a:prstGeom>
+                    <a:noFill/>
                   </pic:spPr>
                 </pic:pic>
               </a:graphicData>
             </a:graphic>
-          </wp:inline>
+          </wp:anchor>
         </w:drawing>
       </w:r>
-    </w:p>
-    <w:p>
       <w:r>
         <w:rPr>
           <w:noProof/>
+          <w:lang w:val="es-AR" w:eastAsia="es-AR"/>
         </w:rPr>
         <w:drawing>
-          <wp:anchor distT="0" distB="0" distL="114300" distR="114300" simplePos="0" relativeHeight="251660288" behindDoc="1" locked="0" layoutInCell="1" allowOverlap="1" wp14:anchorId="4A222655" wp14:editId="08C704A1">
+          <wp:anchor distT="0" distB="0" distL="114300" distR="114300" simplePos="0" relativeHeight="251661312" behindDoc="1" locked="0" layoutInCell="1" allowOverlap="1" wp14:anchorId="5FD0D159" wp14:editId="691FA13E">
             <wp:simplePos x="0" y="0"/>
-            <wp:positionH relativeFrom="column">
-              <wp:posOffset>0</wp:posOffset>
+            <wp:positionH relativeFrom="margin">
+              <wp:posOffset>3162300</wp:posOffset>
             </wp:positionH>
             <wp:positionV relativeFrom="paragraph">
-              <wp:posOffset>-1905</wp:posOffset>
+              <wp:posOffset>12700</wp:posOffset>
             </wp:positionV>
-            <wp:extent cx="6646545" cy="1092835"/>
-            <wp:effectExtent l="0" t="0" r="1905" b="0"/>
+            <wp:extent cx="2124075" cy="962025"/>
+            <wp:effectExtent l="0" t="0" r="9525" b="9525"/>
             <wp:wrapTight wrapText="bothSides">
               <wp:wrapPolygon edited="0">
                 <wp:start x="0" y="0"/>
-                <wp:lineTo x="0" y="21085"/>
-                <wp:lineTo x="21544" y="21085"/>
-                <wp:lineTo x="21544" y="0"/>
+                <wp:lineTo x="0" y="21386"/>
+                <wp:lineTo x="21503" y="21386"/>
+                <wp:lineTo x="21503" y="0"/>
                 <wp:lineTo x="0" y="0"/>
               </wp:wrapPolygon>
             </wp:wrapTight>
-            <wp:docPr id="6" name="Picture 6"/>
+            <wp:docPr id="9" name="Picture 9"/>
             <wp:cNvGraphicFramePr>
               <a:graphicFrameLocks xmlns:a="http://schemas.openxmlformats.org/drawingml/2006/main" noChangeAspect="1"/>
             </wp:cNvGraphicFramePr>
@@ -282,7 +560,7 @@
                   <pic:spPr>
                     <a:xfrm>
                       <a:off x="0" y="0"/>
-                      <a:ext cx="6646545" cy="1092835"/>
+                      <a:ext cx="2124075" cy="962025"/>
                     </a:xfrm>
                     <a:prstGeom prst="rect">
                       <a:avLst/>
@@ -293,6 +571,454 @@
             </a:graphic>
           </wp:anchor>
         </w:drawing>
+      </w:r>
+    </w:p>
+    <w:p>
+      <w:pPr>
+        <w:jc w:val="both"/>
+        <w:rPr>
+          <w:lang w:val="es-AR"/>
+        </w:rPr>
+      </w:pPr>
+    </w:p>
+    <w:p>
+      <w:pPr>
+        <w:jc w:val="both"/>
+        <w:rPr>
+          <w:lang w:val="es-AR"/>
+        </w:rPr>
+      </w:pPr>
+    </w:p>
+    <w:p>
+      <w:pPr>
+        <w:jc w:val="both"/>
+        <w:rPr>
+          <w:noProof/>
+          <w:lang w:val="es-AR" w:eastAsia="es-AR"/>
+        </w:rPr>
+      </w:pPr>
+      <w:r>
+        <w:rPr>
+          <w:noProof/>
+          <w:lang w:val="es-AR" w:eastAsia="es-AR"/>
+        </w:rPr>
+        <w:t xml:space="preserve"> </w:t>
+      </w:r>
+    </w:p>
+    <w:p>
+      <w:pPr>
+        <w:jc w:val="both"/>
+        <w:rPr>
+          <w:noProof/>
+          <w:lang w:val="es-AR" w:eastAsia="es-AR"/>
+        </w:rPr>
+      </w:pPr>
+      <w:r>
+        <w:rPr>
+          <w:noProof/>
+          <w:lang w:val="es-AR" w:eastAsia="es-AR"/>
+        </w:rPr>
+        <w:t xml:space="preserve">La lista de elementos esta definido en el archivo de fungen_selector.py, en la siguiente seccion de codigo </w:t>
+      </w:r>
+      <w:bookmarkStart w:id="0" w:name="_MON_1668424435"/>
+      <w:bookmarkEnd w:id="0"/>
+      <w:r>
+        <w:rPr>
+          <w:noProof/>
+          <w:lang w:val="es-AR" w:eastAsia="es-AR"/>
+        </w:rPr>
+        <w:object w:dxaOrig="10467" w:dyaOrig="4918" w14:anchorId="0A4D4A91">
+          <v:shapetype id="_x0000_t75" coordsize="21600,21600" o:spt="75" o:preferrelative="t" path="m@4@5l@4@11@9@11@9@5xe" filled="f" stroked="f">
+            <v:stroke joinstyle="miter"/>
+            <v:formulas>
+              <v:f eqn="if lineDrawn pixelLineWidth 0"/>
+              <v:f eqn="sum @0 1 0"/>
+              <v:f eqn="sum 0 0 @1"/>
+              <v:f eqn="prod @2 1 2"/>
+              <v:f eqn="prod @3 21600 pixelWidth"/>
+              <v:f eqn="prod @3 21600 pixelHeight"/>
+              <v:f eqn="sum @0 0 1"/>
+              <v:f eqn="prod @6 1 2"/>
+              <v:f eqn="prod @7 21600 pixelWidth"/>
+              <v:f eqn="sum @8 21600 0"/>
+              <v:f eqn="prod @7 21600 pixelHeight"/>
+              <v:f eqn="sum @10 21600 0"/>
+            </v:formulas>
+            <v:path o:extrusionok="f" gradientshapeok="t" o:connecttype="rect"/>
+            <o:lock v:ext="edit" aspectratio="t"/>
+          </v:shapetype>
+          <v:shape id="_x0000_i1025" type="#_x0000_t75" style="width:523.5pt;height:246pt" o:ole="">
+            <v:imagedata r:id="rId10" o:title=""/>
+          </v:shape>
+          <o:OLEObject Type="Embed" ProgID="Word.OpenDocumentText.12" ShapeID="_x0000_i1025" DrawAspect="Content" ObjectID="_1668436634" r:id="rId11"/>
+        </w:object>
+      </w:r>
+    </w:p>
+    <w:p>
+      <w:pPr>
+        <w:jc w:val="both"/>
+        <w:rPr>
+          <w:lang w:val="es-AR"/>
+        </w:rPr>
+      </w:pPr>
+      <w:r>
+        <w:rPr>
+          <w:lang w:val="es-AR"/>
+        </w:rPr>
+        <w:t>El diccionario de “</w:t>
+      </w:r>
+      <w:proofErr w:type="spellStart"/>
+      <w:r>
+        <w:rPr>
+          <w:lang w:val="es-AR"/>
+        </w:rPr>
+        <w:t>fungen_available</w:t>
+      </w:r>
+      <w:proofErr w:type="spellEnd"/>
+      <w:r>
+        <w:rPr>
+          <w:lang w:val="es-AR"/>
+        </w:rPr>
+        <w:t xml:space="preserve">” contiene todos los Generadores de Funciones </w:t>
+      </w:r>
+      <w:r>
+        <w:rPr>
+          <w:lang w:val="es-AR"/>
+        </w:rPr>
+        <w:t xml:space="preserve">disponibles al usuario. Para agregar uno es necesario agregar una entrada a este diccionario. El diccionario apunta a una función, definida arriba, la cual inicializa y devuelve el driver. Esta función tiene que ser sin parámetros. </w:t>
+      </w:r>
+    </w:p>
+    <w:p>
+      <w:pPr>
+        <w:jc w:val="both"/>
+        <w:rPr>
+          <w:lang w:val="es-AR"/>
+        </w:rPr>
+      </w:pPr>
+      <w:r>
+        <w:rPr>
+          <w:lang w:val="es-AR"/>
+        </w:rPr>
+        <w:t>En el ejemplo mostrado arriba si la lista está en Virtual al cargar el archivo ejecuta la función “virtual” que devuelve una instancia del driver virtual.</w:t>
+      </w:r>
+    </w:p>
+    <w:p>
+      <w:pPr>
+        <w:pStyle w:val="Heading1"/>
+        <w:jc w:val="both"/>
+      </w:pPr>
+      <w:r>
+        <w:t>3. Carga de Configuración</w:t>
+      </w:r>
+    </w:p>
+    <w:p>
+      <w:pPr>
+        <w:rPr>
+          <w:lang w:val="es-AR"/>
+        </w:rPr>
+      </w:pPr>
+      <w:r>
+        <w:rPr>
+          <w:lang w:val="es-AR"/>
+        </w:rPr>
+        <w:t>En caso de tener datos que se quieran cargar de un archivo de configuración “.</w:t>
+      </w:r>
+      <w:proofErr w:type="spellStart"/>
+      <w:r>
+        <w:rPr>
+          <w:lang w:val="es-AR"/>
+        </w:rPr>
+        <w:t>cfg</w:t>
+      </w:r>
+      <w:proofErr w:type="spellEnd"/>
+      <w:r>
+        <w:rPr>
+          <w:lang w:val="es-AR"/>
+        </w:rPr>
+        <w:t>” el programa tiene un botón para cargar configuración. Este botón ejecuta la función “</w:t>
+      </w:r>
+      <w:proofErr w:type="spellStart"/>
+      <w:r>
+        <w:rPr>
+          <w:lang w:val="es-AR"/>
+        </w:rPr>
+        <w:t>load_conf</w:t>
+      </w:r>
+      <w:proofErr w:type="spellEnd"/>
+      <w:r>
+        <w:rPr>
+          <w:lang w:val="es-AR"/>
+        </w:rPr>
+        <w:t>(</w:t>
+      </w:r>
+      <w:proofErr w:type="spellStart"/>
+      <w:r>
+        <w:rPr>
+          <w:lang w:val="es-AR"/>
+        </w:rPr>
+        <w:t>self</w:t>
+      </w:r>
+      <w:proofErr w:type="spellEnd"/>
+      <w:r>
+        <w:rPr>
+          <w:lang w:val="es-AR"/>
+        </w:rPr>
+        <w:t>)” que define un parámetro interno “</w:t>
+      </w:r>
+      <w:proofErr w:type="spellStart"/>
+      <w:proofErr w:type="gramStart"/>
+      <w:r>
+        <w:rPr>
+          <w:lang w:val="es-AR"/>
+        </w:rPr>
+        <w:t>self.conf</w:t>
+      </w:r>
+      <w:proofErr w:type="spellEnd"/>
+      <w:proofErr w:type="gramEnd"/>
+      <w:r>
+        <w:rPr>
+          <w:lang w:val="es-AR"/>
+        </w:rPr>
+        <w:t>”.</w:t>
+      </w:r>
+    </w:p>
+    <w:p>
+      <w:pPr>
+        <w:rPr>
+          <w:lang w:val="es-AR"/>
+        </w:rPr>
+      </w:pPr>
+    </w:p>
+    <w:bookmarkStart w:id="1" w:name="_MON_1668435572"/>
+    <w:bookmarkEnd w:id="1"/>
+    <w:p>
+      <w:pPr>
+        <w:rPr>
+          <w:lang w:val="es-AR"/>
+        </w:rPr>
+      </w:pPr>
+      <w:r>
+        <w:rPr>
+          <w:lang w:val="es-AR"/>
+        </w:rPr>
+        <w:object w:dxaOrig="10467" w:dyaOrig="1171" w14:anchorId="1A8BA138">
+          <v:shape id="_x0000_i1026" type="#_x0000_t75" style="width:523.5pt;height:58.5pt" o:ole="">
+            <v:imagedata r:id="rId12" o:title=""/>
+          </v:shape>
+          <o:OLEObject Type="Embed" ProgID="Word.OpenDocumentText.12" ShapeID="_x0000_i1026" DrawAspect="Content" ObjectID="_1668436635" r:id="rId13"/>
+        </w:object>
+      </w:r>
+      <w:bookmarkStart w:id="2" w:name="_GoBack"/>
+      <w:bookmarkEnd w:id="2"/>
+    </w:p>
+    <w:p>
+      <w:pPr>
+        <w:rPr>
+          <w:lang w:val="es-AR"/>
+        </w:rPr>
+      </w:pPr>
+      <w:r>
+        <w:rPr>
+          <w:lang w:val="es-AR"/>
+        </w:rPr>
+        <w:t xml:space="preserve">Para acceder a los datos en este archivo de configuración </w:t>
+      </w:r>
+      <w:r>
+        <w:rPr>
+          <w:lang w:val="es-AR"/>
+        </w:rPr>
+        <w:t>se hace con la misma sintaxis de diccionarios en Python. Ej.: el driver del DAQ USB_2527 necesita un numero de tableta para poder conectarse, entonces se lo pasamos del archivo de configuración.</w:t>
+      </w:r>
+    </w:p>
+    <w:bookmarkStart w:id="3" w:name="_MON_1668436152"/>
+    <w:bookmarkEnd w:id="3"/>
+    <w:p>
+      <w:pPr>
+        <w:rPr>
+          <w:lang w:val="es-AR"/>
+        </w:rPr>
+      </w:pPr>
+      <w:r>
+        <w:rPr>
+          <w:lang w:val="es-AR"/>
+        </w:rPr>
+        <w:object w:dxaOrig="10467" w:dyaOrig="702" w14:anchorId="0DF3CF34">
+          <v:shape id="_x0000_i1027" type="#_x0000_t75" style="width:523.5pt;height:35.25pt" o:ole="">
+            <v:imagedata r:id="rId14" o:title=""/>
+          </v:shape>
+          <o:OLEObject Type="Embed" ProgID="Word.OpenDocumentText.12" ShapeID="_x0000_i1027" DrawAspect="Content" ObjectID="_1668436636" r:id="rId15"/>
+        </w:object>
+      </w:r>
+    </w:p>
+    <w:p>
+      <w:pPr>
+        <w:rPr>
+          <w:lang w:val="es-AR"/>
+        </w:rPr>
+      </w:pPr>
+      <w:r>
+        <w:rPr>
+          <w:lang w:val="es-AR"/>
+        </w:rPr>
+        <w:t>En caso de ser necesario este parámetro el programa avisa la falta de archivo de configuración.</w:t>
+      </w:r>
+    </w:p>
+    <w:p>
+      <w:pPr>
+        <w:rPr>
+          <w:lang w:val="es-AR"/>
+        </w:rPr>
+      </w:pPr>
+      <w:r>
+        <w:rPr>
+          <w:lang w:val="es-AR"/>
+        </w:rPr>
+        <w:t xml:space="preserve">Ej. del </w:t>
+      </w:r>
+      <w:proofErr w:type="spellStart"/>
+      <w:r>
+        <w:rPr>
+          <w:lang w:val="es-AR"/>
+        </w:rPr>
+        <w:t>conf</w:t>
+      </w:r>
+      <w:proofErr w:type="spellEnd"/>
+      <w:r>
+        <w:rPr>
+          <w:lang w:val="es-AR"/>
+        </w:rPr>
+        <w:t xml:space="preserve"> que viene con el </w:t>
+      </w:r>
+      <w:proofErr w:type="spellStart"/>
+      <w:r>
+        <w:rPr>
+          <w:lang w:val="es-AR"/>
+        </w:rPr>
+        <w:t>daq</w:t>
+      </w:r>
+      <w:proofErr w:type="spellEnd"/>
+      <w:r>
+        <w:rPr>
+          <w:lang w:val="es-AR"/>
+        </w:rPr>
+        <w:t>, llamado “</w:t>
+      </w:r>
+      <w:r>
+        <w:rPr>
+          <w:lang w:val="es-AR"/>
+        </w:rPr>
+        <w:t>usb2527.cfg"</w:t>
+      </w:r>
+    </w:p>
+    <w:bookmarkStart w:id="4" w:name="_MON_1668436422"/>
+    <w:bookmarkEnd w:id="4"/>
+    <w:p>
+      <w:pPr>
+        <w:rPr>
+          <w:lang w:val="es-AR"/>
+        </w:rPr>
+      </w:pPr>
+      <w:r>
+        <w:rPr>
+          <w:lang w:val="es-AR"/>
+        </w:rPr>
+        <w:object w:dxaOrig="10467" w:dyaOrig="468" w14:anchorId="6EADFA12">
+          <v:shape id="_x0000_i1029" type="#_x0000_t75" style="width:523.5pt;height:23.25pt" o:ole="">
+            <v:imagedata r:id="rId16" o:title=""/>
+          </v:shape>
+          <o:OLEObject Type="Embed" ProgID="Word.OpenDocumentText.12" ShapeID="_x0000_i1029" DrawAspect="Content" ObjectID="_1668436637" r:id="rId17"/>
+        </w:object>
+      </w:r>
+    </w:p>
+    <w:p>
+      <w:pPr>
+        <w:pStyle w:val="Heading1"/>
+      </w:pPr>
+      <w:r>
+        <w:t>Apéndice:</w:t>
+      </w:r>
+    </w:p>
+    <w:p>
+      <w:pPr>
+        <w:rPr>
+          <w:lang w:val="es-AR"/>
+        </w:rPr>
+      </w:pPr>
+      <w:r>
+        <w:rPr>
+          <w:lang w:val="es-AR"/>
+        </w:rPr>
+        <w:t xml:space="preserve">La librería usada para la lectura del archivo </w:t>
+      </w:r>
+      <w:proofErr w:type="spellStart"/>
+      <w:r>
+        <w:rPr>
+          <w:lang w:val="es-AR"/>
+        </w:rPr>
+        <w:t>config</w:t>
+      </w:r>
+      <w:proofErr w:type="spellEnd"/>
+      <w:r>
+        <w:rPr>
+          <w:lang w:val="es-AR"/>
+        </w:rPr>
+        <w:t xml:space="preserve"> es “</w:t>
+      </w:r>
+      <w:proofErr w:type="spellStart"/>
+      <w:r>
+        <w:rPr>
+          <w:lang w:val="es-AR"/>
+        </w:rPr>
+        <w:t>configparrser</w:t>
+      </w:r>
+      <w:proofErr w:type="spellEnd"/>
+      <w:r>
+        <w:rPr>
+          <w:lang w:val="es-AR"/>
+        </w:rPr>
+        <w:t xml:space="preserve">” una librería que viene estándar con las instalaciones de Python como la de Anaconda. </w:t>
+      </w:r>
+      <w:r>
+        <w:rPr>
+          <w:lang w:val="es-AR"/>
+        </w:rPr>
+        <w:t>Acá</w:t>
+      </w:r>
+      <w:r>
+        <w:rPr>
+          <w:lang w:val="es-AR"/>
+        </w:rPr>
+        <w:t xml:space="preserve"> </w:t>
+      </w:r>
+      <w:r>
+        <w:rPr>
+          <w:lang w:val="es-AR"/>
+        </w:rPr>
+        <w:t>está</w:t>
+      </w:r>
+      <w:r>
+        <w:rPr>
+          <w:lang w:val="es-AR"/>
+        </w:rPr>
+        <w:t xml:space="preserve"> el link a la </w:t>
+      </w:r>
+      <w:r>
+        <w:rPr>
+          <w:lang w:val="es-AR"/>
+        </w:rPr>
+        <w:t>página</w:t>
+      </w:r>
+      <w:r>
+        <w:rPr>
+          <w:lang w:val="es-AR"/>
+        </w:rPr>
+        <w:t xml:space="preserve"> oficial de documentación: </w:t>
+      </w:r>
+      <w:r>
+        <w:rPr>
+          <w:lang w:val="es-AR"/>
+        </w:rPr>
+        <w:t>https://docs.python.org/3.7/library/configparser.html</w:t>
       </w:r>
     </w:p>
     <w:sectPr>
@@ -306,7 +1032,7 @@
 </file>
 
 <file path=word/styles.xml><?xml version="1.0" encoding="utf-8"?>
-<w:styles xmlns:mc="http://schemas.openxmlformats.org/markup-compatibility/2006" xmlns:r="http://schemas.openxmlformats.org/officeDocument/2006/relationships" xmlns:w="http://schemas.openxmlformats.org/wordprocessingml/2006/main" xmlns:w14="http://schemas.microsoft.com/office/word/2010/wordml" xmlns:w15="http://schemas.microsoft.com/office/word/2012/wordml" xmlns:w16cex="http://schemas.microsoft.com/office/word/2018/wordml/cex" xmlns:w16cid="http://schemas.microsoft.com/office/word/2016/wordml/cid" xmlns:w16="http://schemas.microsoft.com/office/word/2018/wordml" xmlns:w16se="http://schemas.microsoft.com/office/word/2015/wordml/symex" mc:Ignorable="w14 w15 w16se w16cid w16 w16cex">
+<w:styles xmlns:mc="http://schemas.openxmlformats.org/markup-compatibility/2006" xmlns:r="http://schemas.openxmlformats.org/officeDocument/2006/relationships" xmlns:w="http://schemas.openxmlformats.org/wordprocessingml/2006/main" xmlns:w14="http://schemas.microsoft.com/office/word/2010/wordml" xmlns:w15="http://schemas.microsoft.com/office/word/2012/wordml" xmlns:w16se="http://schemas.microsoft.com/office/word/2015/wordml/symex" mc:Ignorable="w14 w15 w16se">
   <w:docDefaults>
     <w:rPrDefault>
       <w:rPr>
@@ -322,7 +1048,7 @@
       </w:pPr>
     </w:pPrDefault>
   </w:docDefaults>
-  <w:latentStyles w:defLockedState="0" w:defUIPriority="99" w:defSemiHidden="0" w:defUnhideWhenUsed="0" w:defQFormat="0" w:count="376">
+  <w:latentStyles w:defLockedState="0" w:defUIPriority="99" w:defSemiHidden="0" w:defUnhideWhenUsed="0" w:defQFormat="0" w:count="371">
     <w:lsdException w:name="Normal" w:uiPriority="0" w:qFormat="1"/>
     <w:lsdException w:name="heading 1" w:uiPriority="9" w:qFormat="1"/>
     <w:lsdException w:name="heading 2" w:semiHidden="1" w:uiPriority="9" w:unhideWhenUsed="1" w:qFormat="1"/>
@@ -694,15 +1420,32 @@
     <w:lsdException w:name="List Table 5 Dark Accent 6" w:uiPriority="50"/>
     <w:lsdException w:name="List Table 6 Colorful Accent 6" w:uiPriority="51"/>
     <w:lsdException w:name="List Table 7 Colorful Accent 6" w:uiPriority="52"/>
-    <w:lsdException w:name="Mention" w:semiHidden="1" w:unhideWhenUsed="1"/>
-    <w:lsdException w:name="Smart Hyperlink" w:semiHidden="1" w:unhideWhenUsed="1"/>
-    <w:lsdException w:name="Hashtag" w:semiHidden="1" w:unhideWhenUsed="1"/>
-    <w:lsdException w:name="Unresolved Mention" w:semiHidden="1" w:unhideWhenUsed="1"/>
-    <w:lsdException w:name="Smart Link" w:semiHidden="1" w:unhideWhenUsed="1"/>
   </w:latentStyles>
   <w:style w:type="paragraph" w:default="1" w:styleId="Normal">
     <w:name w:val="Normal"/>
     <w:qFormat/>
+  </w:style>
+  <w:style w:type="paragraph" w:styleId="Heading1">
+    <w:name w:val="heading 1"/>
+    <w:basedOn w:val="Normal"/>
+    <w:next w:val="Normal"/>
+    <w:link w:val="Heading1Char"/>
+    <w:uiPriority w:val="9"/>
+    <w:qFormat/>
+    <w:rsid w:val="000B5A2E"/>
+    <w:pPr>
+      <w:keepNext/>
+      <w:keepLines/>
+      <w:spacing w:before="240" w:after="0"/>
+      <w:outlineLvl w:val="0"/>
+    </w:pPr>
+    <w:rPr>
+      <w:rFonts w:asciiTheme="majorHAnsi" w:eastAsiaTheme="majorEastAsia" w:hAnsiTheme="majorHAnsi" w:cstheme="majorBidi"/>
+      <w:sz w:val="32"/>
+      <w:szCs w:val="32"/>
+      <w:u w:val="single"/>
+      <w:lang w:val="es-AR"/>
+    </w:rPr>
   </w:style>
   <w:style w:type="character" w:default="1" w:styleId="DefaultParagraphFont">
     <w:name w:val="Default Paragraph Font"/>
@@ -730,6 +1473,54 @@
     <w:uiPriority w:val="99"/>
     <w:semiHidden/>
     <w:unhideWhenUsed/>
+  </w:style>
+  <w:style w:type="paragraph" w:styleId="Title">
+    <w:name w:val="Title"/>
+    <w:basedOn w:val="Normal"/>
+    <w:next w:val="Normal"/>
+    <w:link w:val="TitleChar"/>
+    <w:uiPriority w:val="10"/>
+    <w:qFormat/>
+    <w:rsid w:val="000B5A2E"/>
+    <w:pPr>
+      <w:spacing w:after="0" w:line="240" w:lineRule="auto"/>
+      <w:contextualSpacing/>
+    </w:pPr>
+    <w:rPr>
+      <w:rFonts w:asciiTheme="majorHAnsi" w:eastAsiaTheme="majorEastAsia" w:hAnsiTheme="majorHAnsi" w:cstheme="majorBidi"/>
+      <w:spacing w:val="-10"/>
+      <w:kern w:val="28"/>
+      <w:sz w:val="56"/>
+      <w:szCs w:val="56"/>
+    </w:rPr>
+  </w:style>
+  <w:style w:type="character" w:customStyle="1" w:styleId="TitleChar">
+    <w:name w:val="Title Char"/>
+    <w:basedOn w:val="DefaultParagraphFont"/>
+    <w:link w:val="Title"/>
+    <w:uiPriority w:val="10"/>
+    <w:rsid w:val="000B5A2E"/>
+    <w:rPr>
+      <w:rFonts w:asciiTheme="majorHAnsi" w:eastAsiaTheme="majorEastAsia" w:hAnsiTheme="majorHAnsi" w:cstheme="majorBidi"/>
+      <w:spacing w:val="-10"/>
+      <w:kern w:val="28"/>
+      <w:sz w:val="56"/>
+      <w:szCs w:val="56"/>
+    </w:rPr>
+  </w:style>
+  <w:style w:type="character" w:customStyle="1" w:styleId="Heading1Char">
+    <w:name w:val="Heading 1 Char"/>
+    <w:basedOn w:val="DefaultParagraphFont"/>
+    <w:link w:val="Heading1"/>
+    <w:uiPriority w:val="9"/>
+    <w:rsid w:val="000B5A2E"/>
+    <w:rPr>
+      <w:rFonts w:asciiTheme="majorHAnsi" w:eastAsiaTheme="majorEastAsia" w:hAnsiTheme="majorHAnsi" w:cstheme="majorBidi"/>
+      <w:sz w:val="32"/>
+      <w:szCs w:val="32"/>
+      <w:u w:val="single"/>
+      <w:lang w:val="es-AR"/>
+    </w:rPr>
   </w:style>
 </w:styles>
 </file>
@@ -1034,7 +1825,7 @@
 </file>
 
 <file path=customXml/itemProps1.xml><?xml version="1.0" encoding="utf-8"?>
-<ds:datastoreItem xmlns:ds="http://schemas.openxmlformats.org/officeDocument/2006/customXml" ds:itemID="{068B84FA-9B0A-42FB-AAAF-084E0CA4C1FF}">
+<ds:datastoreItem xmlns:ds="http://schemas.openxmlformats.org/officeDocument/2006/customXml" ds:itemID="{D9D6F2BB-1515-4712-828F-7F6C8A530EFC}">
   <ds:schemaRefs>
     <ds:schemaRef ds:uri="http://schemas.openxmlformats.org/officeDocument/2006/bibliography"/>
   </ds:schemaRefs>

</xml_diff>